<commit_message>
Gurbette Cami metnini ve bölüm gezinmesini incelt
</commit_message>
<xml_diff>
--- a/public/vaazlar/gurbette-cami.docx
+++ b/public/vaazlar/gurbette-cami.docx
@@ -2638,7 +2638,7 @@
           <w:szCs w:val="21"/>
           <w:lang w:val="tr-TR" w:bidi="ar-SA"/>
         </w:rPr>
-        <w:t>İçimizde sabahın erken saatlerinde işine yetişenler, yıllarca emek verip artık torunlarının elinden tutanlar, evinin ve ailesinin yükünü taşıyan hanımlar, burada doğup iki dilin arasında büyüyen gençler var. Memlekette bıraktığımız bir annenin sesi, uzaktaki bir mezarın hasreti, çocuklarımızın geleceğine dair bir kaygı hepimizin gönlünde ayrı bir yerde duruyor.</w:t>
+        <w:t>İçimizde sabahın erken saatlerinde işine yetişenler, yıllarca emek verip şimdi torunlarının elinden tutanlar, evinin ve ailesinin yükünü paylaşanlar, burada doğup birden fazla dilin zenginliğiyle büyüyen gençler var. Kiminin gönlünde memleketteki bir annenin sesi, kimininkinde uzaktaki bir mezarın hasreti, kimininkinde çocuklarının geleceği duruyor. Hasreti taşıyan büyüklerimiz de burada kendine bir hayat kuran yeni nesillerimiz de bu cemaatin içinde yer bulsun.</w:t>
       </w:r>
     </w:p>
     <w:p>
@@ -2780,7 +2780,7 @@
                 <w:szCs w:val="20"/>
                 <w:lang w:val="tr-TR" w:bidi="ar-SA"/>
               </w:rPr>
-              <w:t>“İki dilin arasında” ifadesini gençleri eksik veya yabancı göstermek için kullanmayın. Camiye yeni gelen, dinî bilgisi az olan veya Türkçe anlamakta zorlanan kişi için davetkâr bir ton kurun. Ana cümleden sonra kısa bir sükût bırakın.</w:t>
+              <w:t>Gurbet hasretini anlatırken burada doğan nesillerin bu ülkeyi evi olarak görmesini de saygıyla karşılayın. Camiye yeni gelen, dinî bilgisi az olan veya Türkçe anlamakta zorlanan kişi için davetkâr bir ton kurun. Ana cümleden sonra kısa bir sükût bırakın.</w:t>
             </w:r>
           </w:p>
         </w:tc>
@@ -4084,7 +4084,7 @@
           <w:szCs w:val="22"/>
           <w:lang w:val="tr-TR" w:bidi="ar-SA"/>
         </w:rPr>
-        <w:t>Sevgili genç kardeşim! Sorunla, arayışınla ve öğrenme isteğinle bu cemaatin içindesin.</w:t>
+        <w:t>Sevgili genç kardeşim! Sorularınla, arayışınla ve öğrenme isteğinle bu cemaatin içindesin.</w:t>
       </w:r>
     </w:p>
     <w:p>
@@ -7611,7 +7611,7 @@
           <w:szCs w:val="21"/>
           <w:lang w:val="tr-TR" w:bidi="ar-SA"/>
         </w:rPr>
-        <w:t>İlk geldiğimizde bizi karşılayan insanı hatırlayalım. Yeni gelen için biz de o insan olabiliriz. Yalnız kaldığımızda bir telefonun kıymetini hatırlayalım. Başkasının telefonunu arayan biz olabiliriz. Çocuğumuza gösterilmesini istediğimiz sabrı düşünelim. Başka bir çocuğa o sabrı gösteren biz olabiliriz.</w:t>
+        <w:t>İlk geldiğimizde bizi karşılayan insanı hatırlayalım. Yeni gelen için biz de o insan olabiliriz. Yalnız kaldığımızda bir telefonun kıymetini hatırlayalım. O telefonu açıp bir kardeşimizin hâlini soran biz olabiliriz. Çocuğumuza gösterilmesini istediğimiz sabrı düşünelim. Başka bir çocuğa o sabrı gösteren biz olabiliriz.</w:t>
       </w:r>
     </w:p>
     <w:p>

</xml_diff>